<commit_message>
Add Languages, AICO acronym expansion, international mobility
</commit_message>
<xml_diff>
--- a/Franck_Yeboue_Resume.docx
+++ b/Franck_Yeboue_Resume.docx
@@ -46,7 +46,7 @@
           <w:sz w:val="20"/>
           <w:szCs w:val="20"/>
         </w:rPr>
-        <w:t xml:space="preserve">Columbus, OH (open to remote)  |  </w:t>
+        <w:t xml:space="preserve">Columbus, OH · Open to remote and international mobility  |  </w:t>
       </w:r>
       <w:r>
         <w:rPr>
@@ -378,7 +378,7 @@
           <w:sz w:val="22"/>
           <w:szCs w:val="22"/>
         </w:rPr>
-        <w:t xml:space="preserve">Designed the data model and validation logic for the AICO Membership Portal on Supabase/PostgreSQL, covering 80+ member records, monthly dues, and event cost-sharing.</w:t>
+        <w:t xml:space="preserve">Designed the data model and validation logic for the AICO Membership Portal (Association des Ivoiriens à Columbus, Ohio) on Supabase/PostgreSQL, covering 80+ member records, monthly dues, and event cost-sharing.</w:t>
       </w:r>
     </w:p>
     <w:p>
@@ -1571,6 +1571,61 @@
           <w:sz w:val="24"/>
           <w:szCs w:val="24"/>
         </w:rPr>
+        <w:t xml:space="preserve">LANGUAGES</w:t>
+      </w:r>
+    </w:p>
+    <w:p>
+      <w:pPr>
+        <w:pStyle w:val="ListParagraph"/>
+        <w:numPr>
+          <w:ilvl w:val="0"/>
+          <w:numId w:val="2"/>
+        </w:numPr>
+        <w:spacing w:after="60"/>
+      </w:pPr>
+      <w:r>
+        <w:rPr>
+          <w:rFonts w:ascii="Calibri" w:cs="Calibri" w:eastAsia="Calibri" w:hAnsi="Calibri"/>
+          <w:sz w:val="22"/>
+          <w:szCs w:val="22"/>
+        </w:rPr>
+        <w:t xml:space="preserve">French — Native</w:t>
+      </w:r>
+    </w:p>
+    <w:p>
+      <w:pPr>
+        <w:pStyle w:val="ListParagraph"/>
+        <w:numPr>
+          <w:ilvl w:val="0"/>
+          <w:numId w:val="2"/>
+        </w:numPr>
+        <w:spacing w:after="60"/>
+      </w:pPr>
+      <w:r>
+        <w:rPr>
+          <w:rFonts w:ascii="Calibri" w:cs="Calibri" w:eastAsia="Calibri" w:hAnsi="Calibri"/>
+          <w:sz w:val="22"/>
+          <w:szCs w:val="22"/>
+        </w:rPr>
+        <w:t xml:space="preserve">English — Fluent (primary working language for the past ten years)</w:t>
+      </w:r>
+    </w:p>
+    <w:p>
+      <w:pPr>
+        <w:pBdr>
+          <w:bottom w:val="single" w:color="999999" w:sz="6" w:space="4"/>
+        </w:pBdr>
+        <w:spacing w:after="120" w:before="280"/>
+      </w:pPr>
+      <w:r>
+        <w:rPr>
+          <w:rFonts w:ascii="Calibri" w:cs="Calibri" w:eastAsia="Calibri" w:hAnsi="Calibri"/>
+          <w:b/>
+          <w:bCs/>
+          <w:color w:val="1F2937"/>
+          <w:sz w:val="24"/>
+          <w:szCs w:val="24"/>
+        </w:rPr>
         <w:t xml:space="preserve">SELECTED PROJECTS</w:t>
       </w:r>
     </w:p>
@@ -1661,7 +1716,7 @@
           <w:sz w:val="22"/>
           <w:szCs w:val="22"/>
         </w:rPr>
-        <w:t xml:space="preserve">AICO Membership Portal — Production community portal live at portal.aicocolumbus.org on Cloudflare Pages with a Supabase backend serving 80+ members; covers RLS policies, audit logging, multi-beneficiary payments, recurring dues, special-event cost-sharing, expense tracking, raffles, and Resend email notifications with bilingual EN/FR support.</w:t>
+        <w:t xml:space="preserve">AICO Membership Portal (Association des Ivoiriens à Columbus, Ohio) — Production community portal live at portal.aicocolumbus.org on Cloudflare Pages with a Supabase backend serving 80+ members; covers RLS policies, audit logging, multi-beneficiary payments, recurring dues, special-event cost-sharing, expense tracking, raffles, and Resend email notifications with bilingual EN/FR support.</w:t>
       </w:r>
     </w:p>
     <w:p>

</xml_diff>